<commit_message>
Add detailed paper analysis and innovation roadmap
</commit_message>
<xml_diff>
--- a/bee/bee-paper3-colony-strength-reproduction/docs/第三篇论文复现项目目录结构与VSCode训练操作手册.docx
+++ b/bee/bee-paper3-colony-strength-reproduction/docs/第三篇论文复现项目目录结构与VSCode训练操作手册.docx
@@ -1526,6 +1526,8 @@
         <w:br/>
         <w:t>├── generate_word_manual.py           # 生成本 Word 手册</w:t>
         <w:br/>
+        <w:t>├── generate_paper_analysis.py        # 生成论文深度分析 Word 文档</w:t>
+        <w:br/>
         <w:t>├── archive_manifest.json             # ZIP 审计结果（本地生成）</w:t>
         <w:br/>
         <w:t>├── dataset.yaml                      # Ultralytics 数据集配置（本地生成）</w:t>
@@ -2287,6 +2289,92 @@
                 <w:sz w:val="18"/>
               </w:rPr>
               <w:t>重新生成本 Word 手册</w:t>
+            </w:r>
+          </w:p>
+        </w:tc>
+      </w:tr>
+      <w:tr>
+        <w:tc>
+          <w:tcPr>
+            <w:tcW w:type="dxa" w:w="1814"/>
+            <w:vAlign w:val="center"/>
+            <w:shd w:fill="F8FBFD"/>
+          </w:tcPr>
+          <w:p>
+            <w:pPr>
+              <w:spacing w:after="0"/>
+            </w:pPr>
+            <w:r/>
+            <w:r>
+              <w:rPr>
+                <w:rFonts w:ascii="Microsoft YaHei" w:hAnsi="Microsoft YaHei" w:eastAsia="Microsoft YaHei"/>
+                <w:b w:val="0"/>
+                <w:sz w:val="18"/>
+              </w:rPr>
+              <w:t>generate_paper_analysis.py</w:t>
+            </w:r>
+          </w:p>
+        </w:tc>
+        <w:tc>
+          <w:tcPr>
+            <w:tcW w:type="dxa" w:w="2551"/>
+            <w:vAlign w:val="center"/>
+            <w:shd w:fill="F8FBFD"/>
+          </w:tcPr>
+          <w:p>
+            <w:pPr>
+              <w:spacing w:after="0"/>
+            </w:pPr>
+            <w:r/>
+            <w:r>
+              <w:rPr>
+                <w:rFonts w:ascii="Microsoft YaHei" w:hAnsi="Microsoft YaHei" w:eastAsia="Microsoft YaHei"/>
+                <w:b w:val="0"/>
+                <w:sz w:val="18"/>
+              </w:rPr>
+              <w:t>论文全文、论文表格与复现结果</w:t>
+            </w:r>
+          </w:p>
+        </w:tc>
+        <w:tc>
+          <w:tcPr>
+            <w:tcW w:type="dxa" w:w="2721"/>
+            <w:vAlign w:val="center"/>
+            <w:shd w:fill="F8FBFD"/>
+          </w:tcPr>
+          <w:p>
+            <w:pPr>
+              <w:spacing w:after="0"/>
+            </w:pPr>
+            <w:r/>
+            <w:r>
+              <w:rPr>
+                <w:rFonts w:ascii="Microsoft YaHei" w:hAnsi="Microsoft YaHei" w:eastAsia="Microsoft YaHei"/>
+                <w:b w:val="0"/>
+                <w:sz w:val="18"/>
+              </w:rPr>
+              <w:t>docs/…深度分析与创新改进建议.docx</w:t>
+            </w:r>
+          </w:p>
+        </w:tc>
+        <w:tc>
+          <w:tcPr>
+            <w:tcW w:type="dxa" w:w="2835"/>
+            <w:vAlign w:val="center"/>
+            <w:shd w:fill="F8FBFD"/>
+          </w:tcPr>
+          <w:p>
+            <w:pPr>
+              <w:spacing w:after="0"/>
+            </w:pPr>
+            <w:r/>
+            <w:r>
+              <w:rPr>
+                <w:rFonts w:ascii="Microsoft YaHei" w:hAnsi="Microsoft YaHei" w:eastAsia="Microsoft YaHei"/>
+                <w:b w:val="0"/>
+                <w:sz w:val="18"/>
+              </w:rPr>
+              <w:t>生成通俗论文解读、批判性分析和创新路线</w:t>
             </w:r>
           </w:p>
         </w:tc>
@@ -10810,6 +10898,8 @@
         <w:t>.venv/bin/python generate_report.py</w:t>
         <w:br/>
         <w:t>.venv/bin/python generate_word_manual.py</w:t>
+        <w:br/>
+        <w:t>.venv/bin/python generate_paper_analysis.py</w:t>
         <w:br/>
         <w:br/>
         <w:t># 查看训练进度</w:t>

</xml_diff>